<commit_message>
Apply real template logos & designs to the agreement mock-ups
Extract the actual logos from the uploaded templates and match each venue's
design:
- CPH: real gold crown "Crown Prince Event Hall" wordmark in a cream masthead
  band with gold rule.
- ACD: the new elegant template — botanical "Alvin Studio & Courtyard" logo,
  ivory ground with a decorative gold frame, dark-olive "Event Details" band,
  serif body, gold floret bullets and olive headings.

Logos embedded as data URIs so the HTML and the Chromium-rendered PDFs show
them offline. Regenerated the management (8pp) and client (7pp) PDFs and the
editable DOCX (now with both logos). Content unchanged; still PROPOSED DRAFT.

Co-Authored-By: Claude Opus 4.8 <noreply@anthropic.com>
Claude-Session: https://claude.ai/code/session_01LaupEfu9ji95LqMHE3fqhV
</commit_message>
<xml_diff>
--- a/docs/crown-prince-and-alvin-rental-agreement-EDITABLE.docx
+++ b/docs/crown-prince-and-alvin-rental-agreement-EDITABLE.docx
@@ -145,22 +145,41 @@
     </w:p>
     <w:p>
       <w:pPr>
-        <w:spacing w:after="0"/>
+        <w:spacing w:after="40"/>
       </w:pPr>
       <w:r>
-        <w:rPr>
-          <w:b/>
-          <w:color w:val="22314D"/>
-          <w:sz w:val="40"/>
-        </w:rPr>
-        <w:t>Crown Prince</w:t>
-      </w:r>
-      <w:r>
-        <w:rPr>
-          <w:color w:val="A8821F"/>
-          <w:sz w:val="20"/>
-        </w:rPr>
-        <w:t xml:space="preserve">   EVENT HALL</w:t>
+        <w:drawing>
+          <wp:inline xmlns:a="http://schemas.openxmlformats.org/drawingml/2006/main" xmlns:pic="http://schemas.openxmlformats.org/drawingml/2006/picture">
+            <wp:extent cx="1554480" cy="907309"/>
+            <wp:docPr id="1" name="Picture 1"/>
+            <wp:cNvGraphicFramePr>
+              <a:graphicFrameLocks noChangeAspect="1"/>
+            </wp:cNvGraphicFramePr>
+            <a:graphic>
+              <a:graphicData uri="http://schemas.openxmlformats.org/drawingml/2006/picture">
+                <pic:pic>
+                  <pic:nvPicPr>
+                    <pic:cNvPr id="0" name="cph_logo.png"/>
+                    <pic:cNvPicPr/>
+                  </pic:nvPicPr>
+                  <pic:blipFill>
+                    <a:blip r:embed="rId9"/>
+                    <a:stretch>
+                      <a:fillRect/>
+                    </a:stretch>
+                  </pic:blipFill>
+                  <pic:spPr>
+                    <a:xfrm>
+                      <a:off x="0" y="0"/>
+                      <a:ext cx="1554480" cy="907309"/>
+                    </a:xfrm>
+                    <a:prstGeom prst="rect"/>
+                  </pic:spPr>
+                </pic:pic>
+              </a:graphicData>
+            </a:graphic>
+          </wp:inline>
+        </w:drawing>
       </w:r>
     </w:p>
     <w:p>
@@ -1747,22 +1766,41 @@
     </w:p>
     <w:p>
       <w:pPr>
-        <w:spacing w:after="0"/>
+        <w:spacing w:after="40"/>
       </w:pPr>
       <w:r>
-        <w:rPr>
-          <w:b/>
-          <w:color w:val="22314D"/>
-          <w:sz w:val="40"/>
-        </w:rPr>
-        <w:t>Alvin</w:t>
-      </w:r>
-      <w:r>
-        <w:rPr>
-          <w:color w:val="A8821F"/>
-          <w:sz w:val="20"/>
-        </w:rPr>
-        <w:t xml:space="preserve">   STUDIO &amp; COURTYARD</w:t>
+        <w:drawing>
+          <wp:inline xmlns:a="http://schemas.openxmlformats.org/drawingml/2006/main" xmlns:pic="http://schemas.openxmlformats.org/drawingml/2006/picture">
+            <wp:extent cx="1737360" cy="897355"/>
+            <wp:docPr id="2" name="Picture 2"/>
+            <wp:cNvGraphicFramePr>
+              <a:graphicFrameLocks noChangeAspect="1"/>
+            </wp:cNvGraphicFramePr>
+            <a:graphic>
+              <a:graphicData uri="http://schemas.openxmlformats.org/drawingml/2006/picture">
+                <pic:pic>
+                  <pic:nvPicPr>
+                    <pic:cNvPr id="0" name="acd2_logo.png"/>
+                    <pic:cNvPicPr/>
+                  </pic:nvPicPr>
+                  <pic:blipFill>
+                    <a:blip r:embed="rId10"/>
+                    <a:stretch>
+                      <a:fillRect/>
+                    </a:stretch>
+                  </pic:blipFill>
+                  <pic:spPr>
+                    <a:xfrm>
+                      <a:off x="0" y="0"/>
+                      <a:ext cx="1737360" cy="897355"/>
+                    </a:xfrm>
+                    <a:prstGeom prst="rect"/>
+                  </pic:spPr>
+                </pic:pic>
+              </a:graphicData>
+            </a:graphic>
+          </wp:inline>
+        </w:drawing>
       </w:r>
     </w:p>
     <w:p>

</xml_diff>